<commit_message>
fix env and ai integration
</commit_message>
<xml_diff>
--- a/job-portal-client-side/dist/template/Digitefa CV Template.docx
+++ b/job-portal-client-side/dist/template/Digitefa CV Template.docx
@@ -89,20 +89,370 @@
         <w:rPr>
           <w:noProof/>
         </w:rPr>
+        <w:t>YOUR NAME</w:t>
+      </w:r>
+    </w:p>
+    <w:p>
+      <w:pPr>
+        <w:pStyle w:val="BodyText"/>
+        <w:rPr>
+          <w:b/>
+          <w:sz w:val="56"/>
+        </w:rPr>
+      </w:pPr>
+    </w:p>
+    <w:p>
+      <w:pPr>
+        <w:pStyle w:val="BodyText"/>
+        <w:spacing w:before="8"/>
+        <w:rPr>
+          <w:b/>
+          <w:sz w:val="56"/>
+        </w:rPr>
+      </w:pPr>
+    </w:p>
+    <w:p>
+      <w:pPr>
+        <w:pStyle w:val="Heading2"/>
+        <w:spacing w:before="1"/>
+        <w:ind w:left="57"/>
+        <w:rPr>
+          <w:color w:val="8053A1"/>
+          <w:w w:val="105"/>
+        </w:rPr>
+      </w:pPr>
+      <w:r>
+        <w:rPr>
+          <w:color w:val="8053A1"/>
+          <w:w w:val="105"/>
+        </w:rPr>
+        <w:t>EMAIL</w:t>
+      </w:r>
+    </w:p>
+    <w:p>
+      <w:pPr>
+        <w:pStyle w:val="Heading2"/>
+        <w:spacing w:before="1"/>
+        <w:ind w:left="57"/>
+        <w:rPr>
+          <w:b w:val="0"/>
+          <w:bCs w:val="0"/>
+          <w:color w:val="1D1D1D"/>
+        </w:rPr>
+      </w:pPr>
+      <w:r>
+        <w:rPr>
+          <w:b w:val="0"/>
+          <w:bCs w:val="0"/>
+          <w:color w:val="1D1D1D"/>
+        </w:rPr>
+        <w:t>*</w:t>
+      </w:r>
+      <w:proofErr w:type="gramStart"/>
+      <w:r>
+        <w:rPr>
+          <w:b w:val="0"/>
+          <w:bCs w:val="0"/>
+          <w:color w:val="1D1D1D"/>
+        </w:rPr>
+        <w:t>input</w:t>
+      </w:r>
+      <w:proofErr w:type="gramEnd"/>
+      <w:r>
+        <w:rPr>
+          <w:b w:val="0"/>
+          <w:bCs w:val="0"/>
+          <w:color w:val="1D1D1D"/>
+        </w:rPr>
+        <w:t xml:space="preserve"> your </w:t>
+      </w:r>
+      <w:r>
+        <w:rPr>
+          <w:b w:val="0"/>
+          <w:bCs w:val="0"/>
+          <w:color w:val="1D1D1D"/>
+        </w:rPr>
+        <w:t>email</w:t>
+      </w:r>
+      <w:r>
+        <w:rPr>
+          <w:b w:val="0"/>
+          <w:bCs w:val="0"/>
+          <w:color w:val="1D1D1D"/>
+        </w:rPr>
+        <w:t xml:space="preserve"> here*</w:t>
+      </w:r>
+    </w:p>
+    <w:p>
+      <w:pPr>
+        <w:pStyle w:val="Heading2"/>
+        <w:spacing w:before="1"/>
+        <w:ind w:left="57"/>
+        <w:rPr>
+          <w:b w:val="0"/>
+          <w:bCs w:val="0"/>
+          <w:color w:val="1D1D1D"/>
+        </w:rPr>
+      </w:pPr>
+    </w:p>
+    <w:p>
+      <w:pPr>
+        <w:pStyle w:val="Heading2"/>
+        <w:spacing w:before="1"/>
+        <w:ind w:left="57"/>
+        <w:rPr>
+          <w:color w:val="8053A1"/>
+          <w:w w:val="105"/>
+        </w:rPr>
+      </w:pPr>
+      <w:r>
+        <w:rPr>
+          <w:color w:val="8053A1"/>
+          <w:w w:val="105"/>
+        </w:rPr>
+        <w:t>PHONE NUMBER</w:t>
+      </w:r>
+    </w:p>
+    <w:p>
+      <w:pPr>
+        <w:pStyle w:val="Heading2"/>
+        <w:spacing w:before="1"/>
+        <w:ind w:left="57"/>
+        <w:rPr>
+          <w:b w:val="0"/>
+          <w:bCs w:val="0"/>
+          <w:color w:val="1D1D1D"/>
+        </w:rPr>
+      </w:pPr>
+      <w:r>
+        <w:rPr>
+          <w:b w:val="0"/>
+          <w:bCs w:val="0"/>
+          <w:color w:val="1D1D1D"/>
+        </w:rPr>
+        <w:t>*</w:t>
+      </w:r>
+      <w:proofErr w:type="gramStart"/>
+      <w:r>
+        <w:rPr>
+          <w:b w:val="0"/>
+          <w:bCs w:val="0"/>
+          <w:color w:val="1D1D1D"/>
+        </w:rPr>
+        <w:t>input</w:t>
+      </w:r>
+      <w:proofErr w:type="gramEnd"/>
+      <w:r>
+        <w:rPr>
+          <w:b w:val="0"/>
+          <w:bCs w:val="0"/>
+          <w:color w:val="1D1D1D"/>
+        </w:rPr>
+        <w:t xml:space="preserve"> your </w:t>
+      </w:r>
+      <w:r>
+        <w:rPr>
+          <w:b w:val="0"/>
+          <w:bCs w:val="0"/>
+          <w:color w:val="1D1D1D"/>
+        </w:rPr>
+        <w:t>phone number</w:t>
+      </w:r>
+      <w:r>
+        <w:rPr>
+          <w:b w:val="0"/>
+          <w:bCs w:val="0"/>
+          <w:color w:val="1D1D1D"/>
+        </w:rPr>
+        <w:t xml:space="preserve"> here*</w:t>
+      </w:r>
+    </w:p>
+    <w:p>
+      <w:pPr>
+        <w:pStyle w:val="Heading2"/>
+        <w:spacing w:before="1"/>
+        <w:ind w:left="57"/>
+        <w:rPr>
+          <w:b w:val="0"/>
+          <w:bCs w:val="0"/>
+        </w:rPr>
+      </w:pPr>
+    </w:p>
+    <w:p>
+      <w:pPr>
+        <w:pStyle w:val="Heading2"/>
+        <w:spacing w:before="1"/>
+        <w:ind w:left="57"/>
+        <w:rPr>
+          <w:color w:val="8053A1"/>
+          <w:w w:val="105"/>
+        </w:rPr>
+      </w:pPr>
+      <w:r>
+        <w:rPr>
+          <w:color w:val="8053A1"/>
+          <w:w w:val="105"/>
+        </w:rPr>
+        <w:t>DATE OF BIRTH</w:t>
+      </w:r>
+    </w:p>
+    <w:p>
+      <w:pPr>
+        <w:pStyle w:val="Heading2"/>
+        <w:spacing w:before="1"/>
+        <w:ind w:left="57"/>
+        <w:rPr>
+          <w:b w:val="0"/>
+          <w:bCs w:val="0"/>
+          <w:color w:val="1D1D1D"/>
+        </w:rPr>
+      </w:pPr>
+      <w:r>
+        <w:rPr>
+          <w:b w:val="0"/>
+          <w:bCs w:val="0"/>
+          <w:color w:val="1D1D1D"/>
+        </w:rPr>
+        <w:t>*</w:t>
+      </w:r>
+      <w:proofErr w:type="gramStart"/>
+      <w:r>
+        <w:rPr>
+          <w:b w:val="0"/>
+          <w:bCs w:val="0"/>
+          <w:color w:val="1D1D1D"/>
+        </w:rPr>
+        <w:t>input</w:t>
+      </w:r>
+      <w:proofErr w:type="gramEnd"/>
+      <w:r>
+        <w:rPr>
+          <w:b w:val="0"/>
+          <w:bCs w:val="0"/>
+          <w:color w:val="1D1D1D"/>
+        </w:rPr>
+        <w:t xml:space="preserve"> your </w:t>
+      </w:r>
+      <w:r>
+        <w:rPr>
+          <w:b w:val="0"/>
+          <w:bCs w:val="0"/>
+          <w:color w:val="1D1D1D"/>
+        </w:rPr>
+        <w:t>date of birth</w:t>
+      </w:r>
+      <w:r>
+        <w:rPr>
+          <w:b w:val="0"/>
+          <w:bCs w:val="0"/>
+          <w:color w:val="1D1D1D"/>
+        </w:rPr>
+        <w:t xml:space="preserve"> here*</w:t>
+      </w:r>
+    </w:p>
+    <w:p>
+      <w:pPr>
+        <w:pStyle w:val="Heading2"/>
+        <w:spacing w:before="1"/>
+        <w:ind w:left="57"/>
+        <w:rPr>
+          <w:b w:val="0"/>
+          <w:bCs w:val="0"/>
+        </w:rPr>
+      </w:pPr>
+    </w:p>
+    <w:p>
+      <w:pPr>
+        <w:pStyle w:val="Heading2"/>
+        <w:spacing w:before="1"/>
+        <w:ind w:left="57"/>
+        <w:rPr>
+          <w:color w:val="8053A1"/>
+          <w:w w:val="105"/>
+        </w:rPr>
+      </w:pPr>
+      <w:r>
+        <w:rPr>
+          <w:color w:val="8053A1"/>
+          <w:w w:val="105"/>
+        </w:rPr>
+        <w:t>LOCATION</w:t>
+      </w:r>
+    </w:p>
+    <w:p>
+      <w:pPr>
+        <w:pStyle w:val="Heading2"/>
+        <w:spacing w:before="1"/>
+        <w:ind w:left="57"/>
+        <w:rPr>
+          <w:b w:val="0"/>
+          <w:bCs w:val="0"/>
+          <w:color w:val="1D1D1D"/>
+        </w:rPr>
+      </w:pPr>
+      <w:r>
+        <w:rPr>
+          <w:b w:val="0"/>
+          <w:bCs w:val="0"/>
+          <w:color w:val="1D1D1D"/>
+        </w:rPr>
+        <w:t>*</w:t>
+      </w:r>
+      <w:proofErr w:type="gramStart"/>
+      <w:r>
+        <w:rPr>
+          <w:b w:val="0"/>
+          <w:bCs w:val="0"/>
+          <w:color w:val="1D1D1D"/>
+        </w:rPr>
+        <w:t>input</w:t>
+      </w:r>
+      <w:proofErr w:type="gramEnd"/>
+      <w:r>
+        <w:rPr>
+          <w:b w:val="0"/>
+          <w:bCs w:val="0"/>
+          <w:color w:val="1D1D1D"/>
+        </w:rPr>
+        <w:t xml:space="preserve"> your </w:t>
+      </w:r>
+      <w:r>
+        <w:rPr>
+          <w:b w:val="0"/>
+          <w:bCs w:val="0"/>
+          <w:color w:val="1D1D1D"/>
+        </w:rPr>
+        <w:t>location</w:t>
+      </w:r>
+      <w:r>
+        <w:rPr>
+          <w:b w:val="0"/>
+          <w:bCs w:val="0"/>
+          <w:color w:val="1D1D1D"/>
+        </w:rPr>
+        <w:t xml:space="preserve"> here*</w:t>
+      </w:r>
+    </w:p>
+    <w:p>
+      <w:pPr>
+        <w:pStyle w:val="Heading2"/>
+        <w:spacing w:before="1"/>
+        <w:ind w:left="57"/>
+        <w:rPr>
+          <w:b w:val="0"/>
+          <w:bCs w:val="0"/>
+        </w:rPr>
+      </w:pPr>
+      <w:r>
+        <w:rPr>
+          <w:noProof/>
+        </w:rPr>
         <mc:AlternateContent>
           <mc:Choice Requires="wps">
             <w:drawing>
-              <wp:anchor distT="0" distB="0" distL="0" distR="0" simplePos="0" relativeHeight="15729152" behindDoc="0" locked="0" layoutInCell="1" allowOverlap="1" wp14:anchorId="1BC421D4" wp14:editId="4E52951C">
-                <wp:simplePos x="0" y="0"/>
-                <wp:positionH relativeFrom="page">
-                  <wp:posOffset>495300</wp:posOffset>
-                </wp:positionH>
-                <wp:positionV relativeFrom="page">
-                  <wp:posOffset>2898140</wp:posOffset>
-                </wp:positionV>
-                <wp:extent cx="6571615" cy="1270"/>
+              <wp:inline distT="0" distB="0" distL="0" distR="0" wp14:anchorId="0FA01F9E" wp14:editId="0F8C505A">
+                <wp:extent cx="6040120" cy="1167"/>
                 <wp:effectExtent l="0" t="0" r="0" b="0"/>
-                <wp:wrapNone/>
                 <wp:docPr id="2" name="Graphic 2"/>
                 <wp:cNvGraphicFramePr>
                   <a:graphicFrameLocks xmlns:a="http://schemas.openxmlformats.org/drawingml/2006/main"/>
@@ -116,7 +466,7 @@
                       <wps:spPr>
                         <a:xfrm>
                           <a:off x="0" y="0"/>
-                          <a:ext cx="6571615" cy="1270"/>
+                          <a:ext cx="6040120" cy="1167"/>
                         </a:xfrm>
                         <a:custGeom>
                           <a:avLst/>
@@ -151,19 +501,97 @@
                     </wps:wsp>
                   </a:graphicData>
                 </a:graphic>
-              </wp:anchor>
+              </wp:inline>
             </w:drawing>
           </mc:Choice>
           <mc:Fallback>
             <w:pict>
-              <v:shape w14:anchorId="18EC0748" id="Graphic 2" o:spid="_x0000_s1026" style="position:absolute;margin-left:39pt;margin-top:228.2pt;width:517.45pt;height:.1pt;z-index:15729152;visibility:visible;mso-wrap-style:square;mso-wrap-distance-left:0;mso-wrap-distance-top:0;mso-wrap-distance-right:0;mso-wrap-distance-bottom:0;mso-position-horizontal:absolute;mso-position-horizontal-relative:page;mso-position-vertical:absolute;mso-position-vertical-relative:page;v-text-anchor:top" coordsize="6571615,1270" o:gfxdata="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" path="m,l6571488,e" filled="f" strokecolor="#8053a1" strokeweight=".52936mm">
+              <v:shape w14:anchorId="54AC0CFA" id="Graphic 2" o:spid="_x0000_s1026" style="width:475.6pt;height:.1pt;visibility:visible;mso-wrap-style:square;mso-left-percent:-10001;mso-top-percent:-10001;mso-position-horizontal:absolute;mso-position-horizontal-relative:char;mso-position-vertical:absolute;mso-position-vertical-relative:line;mso-left-percent:-10001;mso-top-percent:-10001;v-text-anchor:top" coordsize="6571615,1167" o:gfxdata="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" path="m,l6571488,e" filled="f" strokecolor="#8053a1" strokeweight=".52936mm">
                 <v:path arrowok="t"/>
-                <w10:wrap anchorx="page" anchory="page"/>
+                <w10:anchorlock/>
               </v:shape>
             </w:pict>
           </mc:Fallback>
         </mc:AlternateContent>
       </w:r>
+    </w:p>
+    <w:p>
+      <w:pPr>
+        <w:pStyle w:val="Heading2"/>
+        <w:spacing w:before="1"/>
+        <w:ind w:left="57"/>
+        <w:rPr>
+          <w:color w:val="8053A1"/>
+          <w:w w:val="105"/>
+        </w:rPr>
+      </w:pPr>
+    </w:p>
+    <w:p>
+      <w:pPr>
+        <w:pStyle w:val="Heading2"/>
+        <w:spacing w:before="1"/>
+        <w:ind w:left="57"/>
+      </w:pPr>
+      <w:r>
+        <w:rPr>
+          <w:color w:val="8053A1"/>
+          <w:w w:val="105"/>
+        </w:rPr>
+        <w:t>PERSONAL</w:t>
+      </w:r>
+      <w:r>
+        <w:rPr>
+          <w:color w:val="8053A1"/>
+          <w:spacing w:val="37"/>
+          <w:w w:val="110"/>
+        </w:rPr>
+        <w:t xml:space="preserve"> </w:t>
+      </w:r>
+      <w:r>
+        <w:rPr>
+          <w:color w:val="8053A1"/>
+          <w:spacing w:val="-2"/>
+          <w:w w:val="110"/>
+        </w:rPr>
+        <w:t>SUMMARY</w:t>
+      </w:r>
+    </w:p>
+    <w:p>
+      <w:pPr>
+        <w:pStyle w:val="BodyText"/>
+        <w:spacing w:before="127"/>
+        <w:ind w:left="57"/>
+        <w:rPr>
+          <w:color w:val="1D1D1D"/>
+        </w:rPr>
+      </w:pPr>
+      <w:r>
+        <w:rPr>
+          <w:color w:val="1D1D1D"/>
+        </w:rPr>
+        <w:t>*</w:t>
+      </w:r>
+      <w:proofErr w:type="gramStart"/>
+      <w:r>
+        <w:rPr>
+          <w:color w:val="1D1D1D"/>
+        </w:rPr>
+        <w:t>input</w:t>
+      </w:r>
+      <w:proofErr w:type="gramEnd"/>
+      <w:r>
+        <w:rPr>
+          <w:color w:val="1D1D1D"/>
+        </w:rPr>
+        <w:t xml:space="preserve"> your personal summary here*</w:t>
+      </w:r>
+    </w:p>
+    <w:p>
+      <w:pPr>
+        <w:pStyle w:val="BodyText"/>
+        <w:spacing w:before="127"/>
+        <w:ind w:left="57"/>
+      </w:pPr>
       <w:r>
         <w:rPr>
           <w:noProof/>
@@ -171,18 +599,10 @@
         <mc:AlternateContent>
           <mc:Choice Requires="wps">
             <w:drawing>
-              <wp:anchor distT="0" distB="0" distL="0" distR="0" simplePos="0" relativeHeight="15729664" behindDoc="0" locked="0" layoutInCell="1" allowOverlap="1" wp14:anchorId="512F3DDE" wp14:editId="1C6560AA">
-                <wp:simplePos x="0" y="0"/>
-                <wp:positionH relativeFrom="page">
-                  <wp:posOffset>549275</wp:posOffset>
-                </wp:positionH>
-                <wp:positionV relativeFrom="page">
-                  <wp:posOffset>4425315</wp:posOffset>
-                </wp:positionV>
-                <wp:extent cx="6571615" cy="1270"/>
+              <wp:inline distT="0" distB="0" distL="0" distR="0" wp14:anchorId="3B13B9E0" wp14:editId="0207E515">
+                <wp:extent cx="6040120" cy="1167"/>
                 <wp:effectExtent l="0" t="0" r="0" b="0"/>
-                <wp:wrapNone/>
-                <wp:docPr id="3" name="Graphic 3"/>
+                <wp:docPr id="92757143" name="Graphic 2"/>
                 <wp:cNvGraphicFramePr>
                   <a:graphicFrameLocks xmlns:a="http://schemas.openxmlformats.org/drawingml/2006/main"/>
                 </wp:cNvGraphicFramePr>
@@ -195,7 +615,7 @@
                       <wps:spPr>
                         <a:xfrm>
                           <a:off x="0" y="0"/>
-                          <a:ext cx="6571615" cy="1270"/>
+                          <a:ext cx="6040120" cy="1167"/>
                         </a:xfrm>
                         <a:custGeom>
                           <a:avLst/>
@@ -230,19 +650,232 @@
                     </wps:wsp>
                   </a:graphicData>
                 </a:graphic>
-              </wp:anchor>
+              </wp:inline>
             </w:drawing>
           </mc:Choice>
           <mc:Fallback>
             <w:pict>
-              <v:shape w14:anchorId="3CE8C2AB" id="Graphic 3" o:spid="_x0000_s1026" style="position:absolute;margin-left:43.25pt;margin-top:348.45pt;width:517.45pt;height:.1pt;z-index:15729664;visibility:visible;mso-wrap-style:square;mso-wrap-distance-left:0;mso-wrap-distance-top:0;mso-wrap-distance-right:0;mso-wrap-distance-bottom:0;mso-position-horizontal:absolute;mso-position-horizontal-relative:page;mso-position-vertical:absolute;mso-position-vertical-relative:page;v-text-anchor:top" coordsize="6571615,1270" o:gfxdata="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" path="m,l6571488,e" filled="f" strokecolor="#8053a1" strokeweight=".52936mm">
+              <v:shape w14:anchorId="57236505" id="Graphic 2" o:spid="_x0000_s1026" style="width:475.6pt;height:.1pt;visibility:visible;mso-wrap-style:square;mso-left-percent:-10001;mso-top-percent:-10001;mso-position-horizontal:absolute;mso-position-horizontal-relative:char;mso-position-vertical:absolute;mso-position-vertical-relative:line;mso-left-percent:-10001;mso-top-percent:-10001;v-text-anchor:top" coordsize="6571615,1167" o:gfxdata="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" path="m,l6571488,e" filled="f" strokecolor="#8053a1" strokeweight=".52936mm">
                 <v:path arrowok="t"/>
-                <w10:wrap anchorx="page" anchory="page"/>
+                <w10:anchorlock/>
               </v:shape>
             </w:pict>
           </mc:Fallback>
         </mc:AlternateContent>
       </w:r>
+    </w:p>
+    <w:p>
+      <w:pPr>
+        <w:pStyle w:val="BodyText"/>
+        <w:spacing w:before="42"/>
+      </w:pPr>
+    </w:p>
+    <w:p>
+      <w:pPr>
+        <w:pStyle w:val="Heading2"/>
+        <w:ind w:left="141"/>
+      </w:pPr>
+      <w:r>
+        <w:rPr>
+          <w:color w:val="8053A1"/>
+          <w:spacing w:val="-2"/>
+          <w:w w:val="110"/>
+        </w:rPr>
+        <w:t>EDUCATION</w:t>
+      </w:r>
+    </w:p>
+    <w:p>
+      <w:pPr>
+        <w:pStyle w:val="Heading3"/>
+        <w:spacing w:before="100" w:line="264" w:lineRule="auto"/>
+        <w:ind w:left="141" w:right="3212"/>
+      </w:pPr>
+      <w:r>
+        <w:rPr>
+          <w:color w:val="1D1D1D"/>
+          <w:spacing w:val="-10"/>
+        </w:rPr>
+        <w:t>*</w:t>
+      </w:r>
+      <w:proofErr w:type="gramStart"/>
+      <w:r>
+        <w:rPr>
+          <w:color w:val="1D1D1D"/>
+          <w:spacing w:val="-10"/>
+        </w:rPr>
+        <w:t>name</w:t>
+      </w:r>
+      <w:proofErr w:type="gramEnd"/>
+      <w:r>
+        <w:rPr>
+          <w:color w:val="1D1D1D"/>
+          <w:spacing w:val="-10"/>
+        </w:rPr>
+        <w:t xml:space="preserve"> of university*</w:t>
+      </w:r>
+      <w:r>
+        <w:rPr>
+          <w:color w:val="1D1D1D"/>
+          <w:spacing w:val="-10"/>
+        </w:rPr>
+        <w:t xml:space="preserve"> </w:t>
+      </w:r>
+      <w:r>
+        <w:rPr>
+          <w:color w:val="1D1D1D"/>
+          <w:spacing w:val="-10"/>
+        </w:rPr>
+        <w:tab/>
+      </w:r>
+      <w:r>
+        <w:rPr>
+          <w:color w:val="1D1D1D"/>
+          <w:spacing w:val="-10"/>
+        </w:rPr>
+        <w:tab/>
+        <w:t xml:space="preserve">        </w:t>
+      </w:r>
+      <w:r>
+        <w:rPr>
+          <w:color w:val="1D1D1D"/>
+          <w:spacing w:val="-10"/>
+        </w:rPr>
+        <w:tab/>
+      </w:r>
+      <w:r>
+        <w:rPr>
+          <w:color w:val="1D1D1D"/>
+          <w:spacing w:val="-10"/>
+        </w:rPr>
+        <w:tab/>
+        <w:t xml:space="preserve">         *start date*</w:t>
+      </w:r>
+      <w:r>
+        <w:rPr>
+          <w:color w:val="1D1D1D"/>
+          <w:spacing w:val="-10"/>
+        </w:rPr>
+        <w:t xml:space="preserve"> </w:t>
+      </w:r>
+      <w:r>
+        <w:rPr>
+          <w:color w:val="1D1D1D"/>
+          <w:spacing w:val="-2"/>
+        </w:rPr>
+        <w:t>*start year*</w:t>
+      </w:r>
+      <w:r>
+        <w:rPr>
+          <w:color w:val="1D1D1D"/>
+          <w:spacing w:val="-2"/>
+        </w:rPr>
+        <w:t>-</w:t>
+      </w:r>
+      <w:r>
+        <w:rPr>
+          <w:color w:val="1D1D1D"/>
+          <w:spacing w:val="-2"/>
+        </w:rPr>
+        <w:t xml:space="preserve"> </w:t>
+      </w:r>
+      <w:r>
+        <w:rPr>
+          <w:color w:val="1D1D1D"/>
+          <w:spacing w:val="-2"/>
+        </w:rPr>
+        <w:t>*end date*</w:t>
+      </w:r>
+      <w:r>
+        <w:rPr>
+          <w:color w:val="1D1D1D"/>
+          <w:spacing w:val="-2"/>
+        </w:rPr>
+        <w:t xml:space="preserve"> </w:t>
+      </w:r>
+      <w:r>
+        <w:rPr>
+          <w:color w:val="1D1D1D"/>
+          <w:spacing w:val="-2"/>
+        </w:rPr>
+        <w:t>*end year*</w:t>
+      </w:r>
+    </w:p>
+    <w:p>
+      <w:pPr>
+        <w:pStyle w:val="BodyText"/>
+        <w:spacing w:line="300" w:lineRule="auto"/>
+        <w:ind w:left="141" w:right="7143"/>
+      </w:pPr>
+      <w:r>
+        <w:rPr>
+          <w:color w:val="1D1D1D"/>
+        </w:rPr>
+        <w:t>*major*</w:t>
+      </w:r>
+      <w:r>
+        <w:rPr>
+          <w:color w:val="1D1D1D"/>
+        </w:rPr>
+        <w:t xml:space="preserve"> </w:t>
+      </w:r>
+      <w:r>
+        <w:rPr>
+          <w:color w:val="1D1D1D"/>
+        </w:rPr>
+        <w:t xml:space="preserve">                 </w:t>
+      </w:r>
+      <w:r>
+        <w:rPr>
+          <w:color w:val="1D1D1D"/>
+          <w:w w:val="105"/>
+        </w:rPr>
+        <w:t>*your degree*</w:t>
+      </w:r>
+    </w:p>
+    <w:p>
+      <w:pPr>
+        <w:pStyle w:val="BodyText"/>
+        <w:spacing w:before="56"/>
+        <w:ind w:left="141"/>
+        <w:rPr>
+          <w:color w:val="1D1D1D"/>
+          <w:spacing w:val="-5"/>
+          <w:w w:val="105"/>
+        </w:rPr>
+      </w:pPr>
+      <w:r>
+        <w:rPr>
+          <w:color w:val="1D1D1D"/>
+          <w:spacing w:val="-5"/>
+          <w:w w:val="105"/>
+        </w:rPr>
+        <w:t>*</w:t>
+      </w:r>
+      <w:proofErr w:type="gramStart"/>
+      <w:r>
+        <w:rPr>
+          <w:color w:val="1D1D1D"/>
+          <w:spacing w:val="-5"/>
+          <w:w w:val="105"/>
+        </w:rPr>
+        <w:t>your</w:t>
+      </w:r>
+      <w:proofErr w:type="gramEnd"/>
+      <w:r>
+        <w:rPr>
+          <w:color w:val="1D1D1D"/>
+          <w:spacing w:val="-5"/>
+          <w:w w:val="105"/>
+        </w:rPr>
+        <w:t xml:space="preserve"> GPA*</w:t>
+      </w:r>
+    </w:p>
+    <w:p>
+      <w:pPr>
+        <w:pStyle w:val="BodyText"/>
+        <w:spacing w:before="56"/>
+        <w:ind w:left="141"/>
+      </w:pPr>
       <w:r>
         <w:rPr>
           <w:noProof/>
@@ -250,18 +883,10 @@
         <mc:AlternateContent>
           <mc:Choice Requires="wps">
             <w:drawing>
-              <wp:anchor distT="0" distB="0" distL="0" distR="0" simplePos="0" relativeHeight="15730176" behindDoc="0" locked="0" layoutInCell="1" allowOverlap="1" wp14:anchorId="783A2CA0" wp14:editId="6ACEF247">
-                <wp:simplePos x="0" y="0"/>
-                <wp:positionH relativeFrom="page">
-                  <wp:posOffset>549275</wp:posOffset>
-                </wp:positionH>
-                <wp:positionV relativeFrom="page">
-                  <wp:posOffset>5039995</wp:posOffset>
-                </wp:positionV>
-                <wp:extent cx="6571615" cy="1270"/>
+              <wp:inline distT="0" distB="0" distL="0" distR="0" wp14:anchorId="1FCD18B7" wp14:editId="6008C06D">
+                <wp:extent cx="6040120" cy="1167"/>
                 <wp:effectExtent l="0" t="0" r="0" b="0"/>
-                <wp:wrapNone/>
-                <wp:docPr id="4" name="Graphic 4"/>
+                <wp:docPr id="939590974" name="Graphic 2"/>
                 <wp:cNvGraphicFramePr>
                   <a:graphicFrameLocks xmlns:a="http://schemas.openxmlformats.org/drawingml/2006/main"/>
                 </wp:cNvGraphicFramePr>
@@ -274,7 +899,7 @@
                       <wps:spPr>
                         <a:xfrm>
                           <a:off x="0" y="0"/>
-                          <a:ext cx="6571615" cy="1270"/>
+                          <a:ext cx="6040120" cy="1167"/>
                         </a:xfrm>
                         <a:custGeom>
                           <a:avLst/>
@@ -309,19 +934,131 @@
                     </wps:wsp>
                   </a:graphicData>
                 </a:graphic>
-              </wp:anchor>
+              </wp:inline>
             </w:drawing>
           </mc:Choice>
           <mc:Fallback>
             <w:pict>
-              <v:shape w14:anchorId="0DF53C75" id="Graphic 4" o:spid="_x0000_s1026" style="position:absolute;margin-left:43.25pt;margin-top:396.85pt;width:517.45pt;height:.1pt;z-index:15730176;visibility:visible;mso-wrap-style:square;mso-wrap-distance-left:0;mso-wrap-distance-top:0;mso-wrap-distance-right:0;mso-wrap-distance-bottom:0;mso-position-horizontal:absolute;mso-position-horizontal-relative:page;mso-position-vertical:absolute;mso-position-vertical-relative:page;v-text-anchor:top" coordsize="6571615,1270" o:gfxdata="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" path="m,l6571488,e" filled="f" strokecolor="#8053a1" strokeweight=".52936mm">
+              <v:shape w14:anchorId="3E6318D3" id="Graphic 2" o:spid="_x0000_s1026" style="width:475.6pt;height:.1pt;visibility:visible;mso-wrap-style:square;mso-left-percent:-10001;mso-top-percent:-10001;mso-position-horizontal:absolute;mso-position-horizontal-relative:char;mso-position-vertical:absolute;mso-position-vertical-relative:line;mso-left-percent:-10001;mso-top-percent:-10001;v-text-anchor:top" coordsize="6571615,1167" o:gfxdata="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" path="m,l6571488,e" filled="f" strokecolor="#8053a1" strokeweight=".52936mm">
                 <v:path arrowok="t"/>
-                <w10:wrap anchorx="page" anchory="page"/>
+                <w10:anchorlock/>
               </v:shape>
             </w:pict>
           </mc:Fallback>
         </mc:AlternateContent>
       </w:r>
+    </w:p>
+    <w:p>
+      <w:pPr>
+        <w:pStyle w:val="BodyText"/>
+        <w:spacing w:before="56"/>
+        <w:ind w:left="141"/>
+      </w:pPr>
+    </w:p>
+    <w:p>
+      <w:pPr>
+        <w:pStyle w:val="Heading2"/>
+      </w:pPr>
+      <w:r>
+        <w:rPr>
+          <w:color w:val="8053A1"/>
+          <w:spacing w:val="-2"/>
+          <w:w w:val="110"/>
+        </w:rPr>
+        <w:t>SKILLS</w:t>
+      </w:r>
+    </w:p>
+    <w:p>
+      <w:pPr>
+        <w:pStyle w:val="BodyText"/>
+        <w:spacing w:before="141"/>
+        <w:ind w:left="227"/>
+        <w:rPr>
+          <w:color w:val="1D1D1D"/>
+          <w:spacing w:val="-5"/>
+          <w:w w:val="105"/>
+        </w:rPr>
+      </w:pPr>
+      <w:r>
+        <w:rPr>
+          <w:color w:val="1D1D1D"/>
+          <w:w w:val="105"/>
+        </w:rPr>
+        <w:t>*Skill1</w:t>
+      </w:r>
+      <w:r>
+        <w:rPr>
+          <w:color w:val="1D1D1D"/>
+          <w:w w:val="105"/>
+        </w:rPr>
+        <w:t>,</w:t>
+      </w:r>
+      <w:r>
+        <w:rPr>
+          <w:color w:val="1D1D1D"/>
+          <w:spacing w:val="15"/>
+          <w:w w:val="105"/>
+        </w:rPr>
+        <w:t xml:space="preserve"> </w:t>
+      </w:r>
+      <w:r>
+        <w:rPr>
+          <w:color w:val="1D1D1D"/>
+          <w:w w:val="105"/>
+        </w:rPr>
+        <w:t>skill2</w:t>
+      </w:r>
+      <w:r>
+        <w:rPr>
+          <w:color w:val="1D1D1D"/>
+          <w:w w:val="105"/>
+        </w:rPr>
+        <w:t>,</w:t>
+      </w:r>
+      <w:r>
+        <w:rPr>
+          <w:color w:val="1D1D1D"/>
+          <w:spacing w:val="15"/>
+          <w:w w:val="105"/>
+        </w:rPr>
+        <w:t xml:space="preserve"> </w:t>
+      </w:r>
+      <w:r>
+        <w:rPr>
+          <w:color w:val="1D1D1D"/>
+          <w:w w:val="105"/>
+        </w:rPr>
+        <w:t>skill3</w:t>
+      </w:r>
+      <w:r>
+        <w:rPr>
+          <w:color w:val="1D1D1D"/>
+          <w:w w:val="105"/>
+        </w:rPr>
+        <w:t>,</w:t>
+      </w:r>
+      <w:r>
+        <w:rPr>
+          <w:color w:val="1D1D1D"/>
+          <w:spacing w:val="14"/>
+          <w:w w:val="105"/>
+        </w:rPr>
+        <w:t xml:space="preserve"> </w:t>
+      </w:r>
+      <w:r>
+        <w:rPr>
+          <w:color w:val="1D1D1D"/>
+          <w:spacing w:val="-5"/>
+          <w:w w:val="105"/>
+        </w:rPr>
+        <w:t>skill4*</w:t>
+      </w:r>
+    </w:p>
+    <w:p>
+      <w:pPr>
+        <w:pStyle w:val="BodyText"/>
+        <w:spacing w:before="141"/>
+      </w:pPr>
       <w:r>
         <w:rPr>
           <w:noProof/>
@@ -329,18 +1066,10 @@
         <mc:AlternateContent>
           <mc:Choice Requires="wps">
             <w:drawing>
-              <wp:anchor distT="0" distB="0" distL="0" distR="0" simplePos="0" relativeHeight="15730688" behindDoc="0" locked="0" layoutInCell="1" allowOverlap="1" wp14:anchorId="20318D40" wp14:editId="280482AE">
-                <wp:simplePos x="0" y="0"/>
-                <wp:positionH relativeFrom="page">
-                  <wp:posOffset>603250</wp:posOffset>
-                </wp:positionH>
-                <wp:positionV relativeFrom="page">
-                  <wp:posOffset>6443980</wp:posOffset>
-                </wp:positionV>
-                <wp:extent cx="6571615" cy="1270"/>
+              <wp:inline distT="0" distB="0" distL="0" distR="0" wp14:anchorId="11339EBA" wp14:editId="2EA5267B">
+                <wp:extent cx="6040120" cy="1167"/>
                 <wp:effectExtent l="0" t="0" r="0" b="0"/>
-                <wp:wrapNone/>
-                <wp:docPr id="5" name="Graphic 5"/>
+                <wp:docPr id="258990564" name="Graphic 2"/>
                 <wp:cNvGraphicFramePr>
                   <a:graphicFrameLocks xmlns:a="http://schemas.openxmlformats.org/drawingml/2006/main"/>
                 </wp:cNvGraphicFramePr>
@@ -353,7 +1082,7 @@
                       <wps:spPr>
                         <a:xfrm>
                           <a:off x="0" y="0"/>
-                          <a:ext cx="6571615" cy="1270"/>
+                          <a:ext cx="6040120" cy="1167"/>
                         </a:xfrm>
                         <a:custGeom>
                           <a:avLst/>
@@ -388,19 +1117,233 @@
                     </wps:wsp>
                   </a:graphicData>
                 </a:graphic>
-              </wp:anchor>
+              </wp:inline>
             </w:drawing>
           </mc:Choice>
           <mc:Fallback>
             <w:pict>
-              <v:shape w14:anchorId="169AF77F" id="Graphic 5" o:spid="_x0000_s1026" style="position:absolute;margin-left:47.5pt;margin-top:507.4pt;width:517.45pt;height:.1pt;z-index:15730688;visibility:visible;mso-wrap-style:square;mso-wrap-distance-left:0;mso-wrap-distance-top:0;mso-wrap-distance-right:0;mso-wrap-distance-bottom:0;mso-position-horizontal:absolute;mso-position-horizontal-relative:page;mso-position-vertical:absolute;mso-position-vertical-relative:page;v-text-anchor:top" coordsize="6571615,1270" o:gfxdata="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" path="m,l6571488,e" filled="f" strokecolor="#8053a1" strokeweight=".52936mm">
+              <v:shape w14:anchorId="68297051" id="Graphic 2" o:spid="_x0000_s1026" style="width:475.6pt;height:.1pt;visibility:visible;mso-wrap-style:square;mso-left-percent:-10001;mso-top-percent:-10001;mso-position-horizontal:absolute;mso-position-horizontal-relative:char;mso-position-vertical:absolute;mso-position-vertical-relative:line;mso-left-percent:-10001;mso-top-percent:-10001;v-text-anchor:top" coordsize="6571615,1167" o:gfxdata="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" path="m,l6571488,e" filled="f" strokecolor="#8053a1" strokeweight=".52936mm">
                 <v:path arrowok="t"/>
-                <w10:wrap anchorx="page" anchory="page"/>
+                <w10:anchorlock/>
               </v:shape>
             </w:pict>
           </mc:Fallback>
         </mc:AlternateContent>
       </w:r>
+    </w:p>
+    <w:p>
+      <w:pPr>
+        <w:pStyle w:val="BodyText"/>
+        <w:spacing w:before="136"/>
+      </w:pPr>
+    </w:p>
+    <w:p>
+      <w:pPr>
+        <w:pStyle w:val="Heading2"/>
+      </w:pPr>
+      <w:r>
+        <w:rPr>
+          <w:color w:val="8053A1"/>
+          <w:spacing w:val="4"/>
+        </w:rPr>
+        <w:t>CERTIFICATIONS</w:t>
+      </w:r>
+      <w:r>
+        <w:rPr>
+          <w:color w:val="8053A1"/>
+          <w:spacing w:val="42"/>
+        </w:rPr>
+        <w:t xml:space="preserve"> </w:t>
+      </w:r>
+      <w:r>
+        <w:rPr>
+          <w:color w:val="8053A1"/>
+          <w:spacing w:val="4"/>
+        </w:rPr>
+        <w:t>&amp;</w:t>
+      </w:r>
+      <w:r>
+        <w:rPr>
+          <w:color w:val="8053A1"/>
+          <w:spacing w:val="48"/>
+        </w:rPr>
+        <w:t xml:space="preserve"> </w:t>
+      </w:r>
+      <w:r>
+        <w:rPr>
+          <w:color w:val="8053A1"/>
+          <w:spacing w:val="-2"/>
+        </w:rPr>
+        <w:t>LICENSES</w:t>
+      </w:r>
+    </w:p>
+    <w:p>
+      <w:pPr>
+        <w:pStyle w:val="BodyText"/>
+        <w:spacing w:before="128"/>
+        <w:ind w:firstLine="227"/>
+        <w:rPr>
+          <w:rFonts w:eastAsia="Verdana" w:hAnsi="Verdana" w:cs="Verdana"/>
+          <w:b/>
+          <w:bCs/>
+          <w:color w:val="1D1D1D"/>
+        </w:rPr>
+      </w:pPr>
+      <w:r>
+        <w:rPr>
+          <w:rFonts w:eastAsia="Verdana" w:hAnsi="Verdana" w:cs="Verdana"/>
+          <w:b/>
+          <w:bCs/>
+          <w:color w:val="1D1D1D"/>
+        </w:rPr>
+        <w:t xml:space="preserve">*License Name* </w:t>
+      </w:r>
+      <w:r>
+        <w:rPr>
+          <w:rFonts w:eastAsia="Verdana" w:hAnsi="Verdana" w:cs="Verdana"/>
+          <w:b/>
+          <w:bCs/>
+          <w:color w:val="1D1D1D"/>
+        </w:rPr>
+        <w:t xml:space="preserve">- </w:t>
+      </w:r>
+      <w:r>
+        <w:rPr>
+          <w:rFonts w:eastAsia="Verdana" w:hAnsi="Verdana" w:cs="Verdana"/>
+          <w:b/>
+          <w:bCs/>
+          <w:color w:val="1D1D1D"/>
+        </w:rPr>
+        <w:t xml:space="preserve">*issuing </w:t>
+      </w:r>
+      <w:proofErr w:type="spellStart"/>
+      <w:r>
+        <w:rPr>
+          <w:rFonts w:eastAsia="Verdana" w:hAnsi="Verdana" w:cs="Verdana"/>
+          <w:b/>
+          <w:bCs/>
+          <w:color w:val="1D1D1D"/>
+        </w:rPr>
+        <w:t>organitation</w:t>
+      </w:r>
+      <w:proofErr w:type="spellEnd"/>
+      <w:r>
+        <w:rPr>
+          <w:rFonts w:eastAsia="Verdana" w:hAnsi="Verdana" w:cs="Verdana"/>
+          <w:b/>
+          <w:bCs/>
+          <w:color w:val="1D1D1D"/>
+        </w:rPr>
+        <w:t>*</w:t>
+      </w:r>
+    </w:p>
+    <w:p>
+      <w:pPr>
+        <w:pStyle w:val="BodyText"/>
+        <w:spacing w:before="128"/>
+        <w:ind w:firstLine="227"/>
+        <w:rPr>
+          <w:rFonts w:eastAsia="Verdana" w:hAnsi="Verdana" w:cs="Verdana"/>
+          <w:b/>
+          <w:bCs/>
+          <w:color w:val="1D1D1D"/>
+        </w:rPr>
+      </w:pPr>
+      <w:r>
+        <w:rPr>
+          <w:rFonts w:eastAsia="Verdana" w:hAnsi="Verdana" w:cs="Verdana"/>
+          <w:b/>
+          <w:bCs/>
+          <w:color w:val="1D1D1D"/>
+        </w:rPr>
+        <w:t>*</w:t>
+      </w:r>
+      <w:proofErr w:type="gramStart"/>
+      <w:r>
+        <w:rPr>
+          <w:rFonts w:eastAsia="Verdana" w:hAnsi="Verdana" w:cs="Verdana"/>
+          <w:b/>
+          <w:bCs/>
+          <w:color w:val="1D1D1D"/>
+        </w:rPr>
+        <w:t>issue</w:t>
+      </w:r>
+      <w:proofErr w:type="gramEnd"/>
+      <w:r>
+        <w:rPr>
+          <w:rFonts w:eastAsia="Verdana" w:hAnsi="Verdana" w:cs="Verdana"/>
+          <w:b/>
+          <w:bCs/>
+          <w:color w:val="1D1D1D"/>
+        </w:rPr>
+        <w:t xml:space="preserve"> date*</w:t>
+      </w:r>
+      <w:r>
+        <w:rPr>
+          <w:rFonts w:eastAsia="Verdana" w:hAnsi="Verdana" w:cs="Verdana"/>
+          <w:b/>
+          <w:bCs/>
+          <w:color w:val="1D1D1D"/>
+        </w:rPr>
+        <w:t xml:space="preserve"> </w:t>
+      </w:r>
+      <w:r>
+        <w:rPr>
+          <w:rFonts w:eastAsia="Verdana" w:hAnsi="Verdana" w:cs="Verdana"/>
+          <w:b/>
+          <w:bCs/>
+          <w:color w:val="1D1D1D"/>
+        </w:rPr>
+        <w:t>–</w:t>
+      </w:r>
+      <w:r>
+        <w:rPr>
+          <w:rFonts w:eastAsia="Verdana" w:hAnsi="Verdana" w:cs="Verdana"/>
+          <w:b/>
+          <w:bCs/>
+          <w:color w:val="1D1D1D"/>
+        </w:rPr>
+        <w:t xml:space="preserve"> </w:t>
+      </w:r>
+      <w:r>
+        <w:rPr>
+          <w:rFonts w:eastAsia="Verdana" w:hAnsi="Verdana" w:cs="Verdana"/>
+          <w:b/>
+          <w:bCs/>
+          <w:color w:val="1D1D1D"/>
+        </w:rPr>
+        <w:t>*expiration date*</w:t>
+      </w:r>
+    </w:p>
+    <w:p>
+      <w:pPr>
+        <w:pStyle w:val="BodyText"/>
+        <w:spacing w:before="128"/>
+        <w:ind w:firstLine="227"/>
+      </w:pPr>
+      <w:hyperlink r:id="rId4" w:history="1">
+        <w:r>
+          <w:rPr>
+            <w:rStyle w:val="Hyperlink"/>
+            <w:rFonts w:eastAsia="Verdana" w:hAnsi="Verdana" w:cs="Verdana"/>
+            <w:b/>
+            <w:bCs/>
+          </w:rPr>
+          <w:t>*Credential URL*</w:t>
+        </w:r>
+      </w:hyperlink>
+    </w:p>
+    <w:p>
+      <w:pPr>
+        <w:pStyle w:val="BodyText"/>
+        <w:spacing w:before="128"/>
+        <w:rPr>
+          <w:rFonts w:eastAsia="Verdana" w:hAnsi="Verdana" w:cs="Verdana"/>
+          <w:b/>
+          <w:bCs/>
+          <w:color w:val="1D1D1D"/>
+        </w:rPr>
+      </w:pPr>
       <w:r>
         <w:rPr>
           <w:noProof/>
@@ -408,18 +1351,10 @@
         <mc:AlternateContent>
           <mc:Choice Requires="wps">
             <w:drawing>
-              <wp:anchor distT="0" distB="0" distL="0" distR="0" simplePos="0" relativeHeight="15731200" behindDoc="0" locked="0" layoutInCell="1" allowOverlap="1" wp14:anchorId="50160A0D" wp14:editId="788C8171">
-                <wp:simplePos x="0" y="0"/>
-                <wp:positionH relativeFrom="page">
-                  <wp:posOffset>603250</wp:posOffset>
-                </wp:positionH>
-                <wp:positionV relativeFrom="page">
-                  <wp:posOffset>7374890</wp:posOffset>
-                </wp:positionV>
-                <wp:extent cx="6571615" cy="1270"/>
+              <wp:inline distT="0" distB="0" distL="0" distR="0" wp14:anchorId="6EC859BA" wp14:editId="43B92A54">
+                <wp:extent cx="6040120" cy="1167"/>
                 <wp:effectExtent l="0" t="0" r="0" b="0"/>
-                <wp:wrapNone/>
-                <wp:docPr id="6" name="Graphic 6"/>
+                <wp:docPr id="2046964820" name="Graphic 2"/>
                 <wp:cNvGraphicFramePr>
                   <a:graphicFrameLocks xmlns:a="http://schemas.openxmlformats.org/drawingml/2006/main"/>
                 </wp:cNvGraphicFramePr>
@@ -432,7 +1367,7 @@
                       <wps:spPr>
                         <a:xfrm>
                           <a:off x="0" y="0"/>
-                          <a:ext cx="6571615" cy="1270"/>
+                          <a:ext cx="6040120" cy="1167"/>
                         </a:xfrm>
                         <a:custGeom>
                           <a:avLst/>
@@ -467,630 +1402,19 @@
                     </wps:wsp>
                   </a:graphicData>
                 </a:graphic>
-              </wp:anchor>
+              </wp:inline>
             </w:drawing>
           </mc:Choice>
           <mc:Fallback>
             <w:pict>
-              <v:shape w14:anchorId="6124C814" id="Graphic 6" o:spid="_x0000_s1026" style="position:absolute;margin-left:47.5pt;margin-top:580.7pt;width:517.45pt;height:.1pt;z-index:15731200;visibility:visible;mso-wrap-style:square;mso-wrap-distance-left:0;mso-wrap-distance-top:0;mso-wrap-distance-right:0;mso-wrap-distance-bottom:0;mso-position-horizontal:absolute;mso-position-horizontal-relative:page;mso-position-vertical:absolute;mso-position-vertical-relative:page;v-text-anchor:top" coordsize="6571615,1270" o:gfxdata="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" path="m,l6571488,e" filled="f" strokecolor="#8053a1" strokeweight=".52936mm">
+              <v:shape w14:anchorId="4E04C2EA" id="Graphic 2" o:spid="_x0000_s1026" style="width:475.6pt;height:.1pt;visibility:visible;mso-wrap-style:square;mso-left-percent:-10001;mso-top-percent:-10001;mso-position-horizontal:absolute;mso-position-horizontal-relative:char;mso-position-vertical:absolute;mso-position-vertical-relative:line;mso-left-percent:-10001;mso-top-percent:-10001;v-text-anchor:top" coordsize="6571615,1167" o:gfxdata="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" path="m,l6571488,e" filled="f" strokecolor="#8053a1" strokeweight=".52936mm">
                 <v:path arrowok="t"/>
-                <w10:wrap anchorx="page" anchory="page"/>
+                <w10:anchorlock/>
               </v:shape>
             </w:pict>
           </mc:Fallback>
         </mc:AlternateContent>
       </w:r>
-      <w:r>
-        <w:rPr>
-          <w:noProof/>
-        </w:rPr>
-        <w:t>YOUR NAME</w:t>
-      </w:r>
-    </w:p>
-    <w:p>
-      <w:pPr>
-        <w:pStyle w:val="BodyText"/>
-        <w:rPr>
-          <w:b/>
-          <w:sz w:val="56"/>
-        </w:rPr>
-      </w:pPr>
-    </w:p>
-    <w:p>
-      <w:pPr>
-        <w:pStyle w:val="BodyText"/>
-        <w:spacing w:before="8"/>
-        <w:rPr>
-          <w:b/>
-          <w:sz w:val="56"/>
-        </w:rPr>
-      </w:pPr>
-    </w:p>
-    <w:p>
-      <w:pPr>
-        <w:pStyle w:val="Heading2"/>
-        <w:spacing w:before="1"/>
-        <w:ind w:left="57"/>
-      </w:pPr>
-      <w:r>
-        <w:rPr>
-          <w:color w:val="8053A1"/>
-          <w:w w:val="105"/>
-        </w:rPr>
-        <w:t>PERSONAL</w:t>
-      </w:r>
-      <w:r>
-        <w:rPr>
-          <w:color w:val="8053A1"/>
-          <w:spacing w:val="37"/>
-          <w:w w:val="110"/>
-        </w:rPr>
-        <w:t xml:space="preserve"> </w:t>
-      </w:r>
-      <w:r>
-        <w:rPr>
-          <w:color w:val="8053A1"/>
-          <w:spacing w:val="-2"/>
-          <w:w w:val="110"/>
-        </w:rPr>
-        <w:t>SUMMARY</w:t>
-      </w:r>
-    </w:p>
-    <w:p>
-      <w:pPr>
-        <w:pStyle w:val="BodyText"/>
-        <w:spacing w:before="127"/>
-        <w:ind w:left="57"/>
-      </w:pPr>
-      <w:r>
-        <w:rPr>
-          <w:color w:val="1D1D1D"/>
-        </w:rPr>
-        <w:t>*</w:t>
-      </w:r>
-      <w:proofErr w:type="gramStart"/>
-      <w:r>
-        <w:rPr>
-          <w:color w:val="1D1D1D"/>
-        </w:rPr>
-        <w:t>input</w:t>
-      </w:r>
-      <w:proofErr w:type="gramEnd"/>
-      <w:r>
-        <w:rPr>
-          <w:color w:val="1D1D1D"/>
-        </w:rPr>
-        <w:t xml:space="preserve"> your personal summary here*</w:t>
-      </w:r>
-    </w:p>
-    <w:p>
-      <w:pPr>
-        <w:pStyle w:val="BodyText"/>
-      </w:pPr>
-    </w:p>
-    <w:p>
-      <w:pPr>
-        <w:pStyle w:val="BodyText"/>
-      </w:pPr>
-    </w:p>
-    <w:p>
-      <w:pPr>
-        <w:pStyle w:val="BodyText"/>
-      </w:pPr>
-    </w:p>
-    <w:p>
-      <w:pPr>
-        <w:pStyle w:val="BodyText"/>
-      </w:pPr>
-    </w:p>
-    <w:p>
-      <w:pPr>
-        <w:pStyle w:val="BodyText"/>
-        <w:spacing w:before="42"/>
-      </w:pPr>
-    </w:p>
-    <w:p>
-      <w:pPr>
-        <w:pStyle w:val="Heading2"/>
-        <w:ind w:left="141"/>
-      </w:pPr>
-      <w:r>
-        <w:rPr>
-          <w:color w:val="8053A1"/>
-          <w:spacing w:val="-2"/>
-          <w:w w:val="110"/>
-        </w:rPr>
-        <w:t>EDUCATION</w:t>
-      </w:r>
-    </w:p>
-    <w:p>
-      <w:pPr>
-        <w:pStyle w:val="Heading3"/>
-        <w:spacing w:before="100" w:line="264" w:lineRule="auto"/>
-        <w:ind w:left="141" w:right="3212"/>
-      </w:pPr>
-      <w:r>
-        <w:rPr>
-          <w:color w:val="1D1D1D"/>
-          <w:spacing w:val="-10"/>
-        </w:rPr>
-        <w:t>*</w:t>
-      </w:r>
-      <w:proofErr w:type="gramStart"/>
-      <w:r>
-        <w:rPr>
-          <w:color w:val="1D1D1D"/>
-          <w:spacing w:val="-10"/>
-        </w:rPr>
-        <w:t>name</w:t>
-      </w:r>
-      <w:proofErr w:type="gramEnd"/>
-      <w:r>
-        <w:rPr>
-          <w:color w:val="1D1D1D"/>
-          <w:spacing w:val="-10"/>
-        </w:rPr>
-        <w:t xml:space="preserve"> of university*</w:t>
-      </w:r>
-      <w:r>
-        <w:rPr>
-          <w:color w:val="1D1D1D"/>
-          <w:spacing w:val="-10"/>
-        </w:rPr>
-        <w:t xml:space="preserve"> </w:t>
-      </w:r>
-      <w:r>
-        <w:rPr>
-          <w:color w:val="1D1D1D"/>
-          <w:spacing w:val="-10"/>
-        </w:rPr>
-        <w:tab/>
-      </w:r>
-      <w:r>
-        <w:rPr>
-          <w:color w:val="1D1D1D"/>
-          <w:spacing w:val="-10"/>
-        </w:rPr>
-        <w:tab/>
-        <w:t xml:space="preserve">        </w:t>
-      </w:r>
-      <w:r>
-        <w:rPr>
-          <w:color w:val="1D1D1D"/>
-          <w:spacing w:val="-10"/>
-        </w:rPr>
-        <w:tab/>
-      </w:r>
-      <w:r>
-        <w:rPr>
-          <w:color w:val="1D1D1D"/>
-          <w:spacing w:val="-10"/>
-        </w:rPr>
-        <w:tab/>
-        <w:t xml:space="preserve">         *start date*</w:t>
-      </w:r>
-      <w:r>
-        <w:rPr>
-          <w:color w:val="1D1D1D"/>
-          <w:spacing w:val="-10"/>
-        </w:rPr>
-        <w:t xml:space="preserve"> </w:t>
-      </w:r>
-      <w:r>
-        <w:rPr>
-          <w:color w:val="1D1D1D"/>
-          <w:spacing w:val="-2"/>
-        </w:rPr>
-        <w:t>*start year*</w:t>
-      </w:r>
-      <w:r>
-        <w:rPr>
-          <w:color w:val="1D1D1D"/>
-          <w:spacing w:val="-2"/>
-        </w:rPr>
-        <w:t>-</w:t>
-      </w:r>
-      <w:r>
-        <w:rPr>
-          <w:color w:val="1D1D1D"/>
-          <w:spacing w:val="-2"/>
-        </w:rPr>
-        <w:t xml:space="preserve"> </w:t>
-      </w:r>
-      <w:r>
-        <w:rPr>
-          <w:color w:val="1D1D1D"/>
-          <w:spacing w:val="-2"/>
-        </w:rPr>
-        <w:t>*end date*</w:t>
-      </w:r>
-      <w:r>
-        <w:rPr>
-          <w:color w:val="1D1D1D"/>
-          <w:spacing w:val="-2"/>
-        </w:rPr>
-        <w:t xml:space="preserve"> </w:t>
-      </w:r>
-      <w:r>
-        <w:rPr>
-          <w:color w:val="1D1D1D"/>
-          <w:spacing w:val="-2"/>
-        </w:rPr>
-        <w:t>*end year*</w:t>
-      </w:r>
-    </w:p>
-    <w:p>
-      <w:pPr>
-        <w:pStyle w:val="BodyText"/>
-        <w:spacing w:line="300" w:lineRule="auto"/>
-        <w:ind w:left="141" w:right="7143"/>
-      </w:pPr>
-      <w:r>
-        <w:rPr>
-          <w:color w:val="1D1D1D"/>
-        </w:rPr>
-        <w:t>*major*</w:t>
-      </w:r>
-      <w:r>
-        <w:rPr>
-          <w:color w:val="1D1D1D"/>
-        </w:rPr>
-        <w:t xml:space="preserve"> </w:t>
-      </w:r>
-      <w:r>
-        <w:rPr>
-          <w:color w:val="1D1D1D"/>
-        </w:rPr>
-        <w:t xml:space="preserve">                 </w:t>
-      </w:r>
-      <w:r>
-        <w:rPr>
-          <w:color w:val="1D1D1D"/>
-          <w:w w:val="105"/>
-        </w:rPr>
-        <w:t>*your degree*</w:t>
-      </w:r>
-    </w:p>
-    <w:p>
-      <w:pPr>
-        <w:pStyle w:val="BodyText"/>
-        <w:spacing w:before="56"/>
-        <w:ind w:left="141"/>
-      </w:pPr>
-      <w:r>
-        <w:rPr>
-          <w:color w:val="1D1D1D"/>
-          <w:spacing w:val="-5"/>
-          <w:w w:val="105"/>
-        </w:rPr>
-        <w:t>*</w:t>
-      </w:r>
-      <w:proofErr w:type="gramStart"/>
-      <w:r>
-        <w:rPr>
-          <w:color w:val="1D1D1D"/>
-          <w:spacing w:val="-5"/>
-          <w:w w:val="105"/>
-        </w:rPr>
-        <w:t>your</w:t>
-      </w:r>
-      <w:proofErr w:type="gramEnd"/>
-      <w:r>
-        <w:rPr>
-          <w:color w:val="1D1D1D"/>
-          <w:spacing w:val="-5"/>
-          <w:w w:val="105"/>
-        </w:rPr>
-        <w:t xml:space="preserve"> GPA*</w:t>
-      </w:r>
-    </w:p>
-    <w:p>
-      <w:pPr>
-        <w:pStyle w:val="BodyText"/>
-        <w:spacing w:before="97"/>
-      </w:pPr>
-    </w:p>
-    <w:p>
-      <w:pPr>
-        <w:pStyle w:val="Heading2"/>
-      </w:pPr>
-      <w:r>
-        <w:rPr>
-          <w:color w:val="8053A1"/>
-          <w:spacing w:val="-2"/>
-          <w:w w:val="110"/>
-        </w:rPr>
-        <w:t>SKILLS</w:t>
-      </w:r>
-    </w:p>
-    <w:p>
-      <w:pPr>
-        <w:pStyle w:val="BodyText"/>
-        <w:spacing w:before="141"/>
-        <w:ind w:left="227"/>
-      </w:pPr>
-      <w:r>
-        <w:rPr>
-          <w:color w:val="1D1D1D"/>
-          <w:w w:val="105"/>
-        </w:rPr>
-        <w:t>*Skill1</w:t>
-      </w:r>
-      <w:r>
-        <w:rPr>
-          <w:color w:val="1D1D1D"/>
-          <w:w w:val="105"/>
-        </w:rPr>
-        <w:t>,</w:t>
-      </w:r>
-      <w:r>
-        <w:rPr>
-          <w:color w:val="1D1D1D"/>
-          <w:spacing w:val="15"/>
-          <w:w w:val="105"/>
-        </w:rPr>
-        <w:t xml:space="preserve"> </w:t>
-      </w:r>
-      <w:r>
-        <w:rPr>
-          <w:color w:val="1D1D1D"/>
-          <w:w w:val="105"/>
-        </w:rPr>
-        <w:t>skill2</w:t>
-      </w:r>
-      <w:r>
-        <w:rPr>
-          <w:color w:val="1D1D1D"/>
-          <w:w w:val="105"/>
-        </w:rPr>
-        <w:t>,</w:t>
-      </w:r>
-      <w:r>
-        <w:rPr>
-          <w:color w:val="1D1D1D"/>
-          <w:spacing w:val="15"/>
-          <w:w w:val="105"/>
-        </w:rPr>
-        <w:t xml:space="preserve"> </w:t>
-      </w:r>
-      <w:r>
-        <w:rPr>
-          <w:color w:val="1D1D1D"/>
-          <w:w w:val="105"/>
-        </w:rPr>
-        <w:t>skill3</w:t>
-      </w:r>
-      <w:r>
-        <w:rPr>
-          <w:color w:val="1D1D1D"/>
-          <w:w w:val="105"/>
-        </w:rPr>
-        <w:t>,</w:t>
-      </w:r>
-      <w:r>
-        <w:rPr>
-          <w:color w:val="1D1D1D"/>
-          <w:spacing w:val="14"/>
-          <w:w w:val="105"/>
-        </w:rPr>
-        <w:t xml:space="preserve"> </w:t>
-      </w:r>
-      <w:r>
-        <w:rPr>
-          <w:color w:val="1D1D1D"/>
-          <w:spacing w:val="-5"/>
-          <w:w w:val="105"/>
-        </w:rPr>
-        <w:t>skill4*</w:t>
-      </w:r>
-    </w:p>
-    <w:p>
-      <w:pPr>
-        <w:pStyle w:val="BodyText"/>
-        <w:spacing w:before="136"/>
-      </w:pPr>
-    </w:p>
-    <w:p>
-      <w:pPr>
-        <w:pStyle w:val="Heading2"/>
-      </w:pPr>
-      <w:r>
-        <w:rPr>
-          <w:color w:val="8053A1"/>
-          <w:spacing w:val="4"/>
-        </w:rPr>
-        <w:t>CERTIFICATIONS</w:t>
-      </w:r>
-      <w:r>
-        <w:rPr>
-          <w:color w:val="8053A1"/>
-          <w:spacing w:val="42"/>
-        </w:rPr>
-        <w:t xml:space="preserve"> </w:t>
-      </w:r>
-      <w:r>
-        <w:rPr>
-          <w:color w:val="8053A1"/>
-          <w:spacing w:val="4"/>
-        </w:rPr>
-        <w:t>&amp;</w:t>
-      </w:r>
-      <w:r>
-        <w:rPr>
-          <w:color w:val="8053A1"/>
-          <w:spacing w:val="48"/>
-        </w:rPr>
-        <w:t xml:space="preserve"> </w:t>
-      </w:r>
-      <w:r>
-        <w:rPr>
-          <w:color w:val="8053A1"/>
-          <w:spacing w:val="-2"/>
-        </w:rPr>
-        <w:t>LICENSES</w:t>
-      </w:r>
-    </w:p>
-    <w:p>
-      <w:pPr>
-        <w:pStyle w:val="BodyText"/>
-        <w:spacing w:before="128"/>
-        <w:ind w:firstLine="227"/>
-        <w:rPr>
-          <w:rFonts w:eastAsia="Verdana" w:hAnsi="Verdana" w:cs="Verdana"/>
-          <w:b/>
-          <w:bCs/>
-          <w:color w:val="1D1D1D"/>
-        </w:rPr>
-      </w:pPr>
-      <w:r>
-        <w:rPr>
-          <w:rFonts w:eastAsia="Verdana" w:hAnsi="Verdana" w:cs="Verdana"/>
-          <w:b/>
-          <w:bCs/>
-          <w:color w:val="1D1D1D"/>
-        </w:rPr>
-        <w:t xml:space="preserve">*License Name* </w:t>
-      </w:r>
-      <w:r>
-        <w:rPr>
-          <w:rFonts w:eastAsia="Verdana" w:hAnsi="Verdana" w:cs="Verdana"/>
-          <w:b/>
-          <w:bCs/>
-          <w:color w:val="1D1D1D"/>
-        </w:rPr>
-        <w:t xml:space="preserve">- </w:t>
-      </w:r>
-      <w:r>
-        <w:rPr>
-          <w:rFonts w:eastAsia="Verdana" w:hAnsi="Verdana" w:cs="Verdana"/>
-          <w:b/>
-          <w:bCs/>
-          <w:color w:val="1D1D1D"/>
-        </w:rPr>
-        <w:t xml:space="preserve">*issuing </w:t>
-      </w:r>
-      <w:proofErr w:type="spellStart"/>
-      <w:r>
-        <w:rPr>
-          <w:rFonts w:eastAsia="Verdana" w:hAnsi="Verdana" w:cs="Verdana"/>
-          <w:b/>
-          <w:bCs/>
-          <w:color w:val="1D1D1D"/>
-        </w:rPr>
-        <w:t>organitation</w:t>
-      </w:r>
-      <w:proofErr w:type="spellEnd"/>
-      <w:r>
-        <w:rPr>
-          <w:rFonts w:eastAsia="Verdana" w:hAnsi="Verdana" w:cs="Verdana"/>
-          <w:b/>
-          <w:bCs/>
-          <w:color w:val="1D1D1D"/>
-        </w:rPr>
-        <w:t>*</w:t>
-      </w:r>
-    </w:p>
-    <w:p>
-      <w:pPr>
-        <w:pStyle w:val="BodyText"/>
-        <w:spacing w:before="128"/>
-        <w:ind w:firstLine="227"/>
-        <w:rPr>
-          <w:rFonts w:eastAsia="Verdana" w:hAnsi="Verdana" w:cs="Verdana"/>
-          <w:b/>
-          <w:bCs/>
-          <w:color w:val="1D1D1D"/>
-        </w:rPr>
-      </w:pPr>
-      <w:r>
-        <w:rPr>
-          <w:rFonts w:eastAsia="Verdana" w:hAnsi="Verdana" w:cs="Verdana"/>
-          <w:b/>
-          <w:bCs/>
-          <w:color w:val="1D1D1D"/>
-        </w:rPr>
-        <w:t>*</w:t>
-      </w:r>
-      <w:proofErr w:type="gramStart"/>
-      <w:r>
-        <w:rPr>
-          <w:rFonts w:eastAsia="Verdana" w:hAnsi="Verdana" w:cs="Verdana"/>
-          <w:b/>
-          <w:bCs/>
-          <w:color w:val="1D1D1D"/>
-        </w:rPr>
-        <w:t>issue</w:t>
-      </w:r>
-      <w:proofErr w:type="gramEnd"/>
-      <w:r>
-        <w:rPr>
-          <w:rFonts w:eastAsia="Verdana" w:hAnsi="Verdana" w:cs="Verdana"/>
-          <w:b/>
-          <w:bCs/>
-          <w:color w:val="1D1D1D"/>
-        </w:rPr>
-        <w:t xml:space="preserve"> date*</w:t>
-      </w:r>
-      <w:r>
-        <w:rPr>
-          <w:rFonts w:eastAsia="Verdana" w:hAnsi="Verdana" w:cs="Verdana"/>
-          <w:b/>
-          <w:bCs/>
-          <w:color w:val="1D1D1D"/>
-        </w:rPr>
-        <w:t xml:space="preserve"> </w:t>
-      </w:r>
-      <w:r>
-        <w:rPr>
-          <w:rFonts w:eastAsia="Verdana" w:hAnsi="Verdana" w:cs="Verdana"/>
-          <w:b/>
-          <w:bCs/>
-          <w:color w:val="1D1D1D"/>
-        </w:rPr>
-        <w:t>–</w:t>
-      </w:r>
-      <w:r>
-        <w:rPr>
-          <w:rFonts w:eastAsia="Verdana" w:hAnsi="Verdana" w:cs="Verdana"/>
-          <w:b/>
-          <w:bCs/>
-          <w:color w:val="1D1D1D"/>
-        </w:rPr>
-        <w:t xml:space="preserve"> </w:t>
-      </w:r>
-      <w:r>
-        <w:rPr>
-          <w:rFonts w:eastAsia="Verdana" w:hAnsi="Verdana" w:cs="Verdana"/>
-          <w:b/>
-          <w:bCs/>
-          <w:color w:val="1D1D1D"/>
-        </w:rPr>
-        <w:t>*expiration date*</w:t>
-      </w:r>
-    </w:p>
-    <w:p>
-      <w:pPr>
-        <w:pStyle w:val="BodyText"/>
-        <w:spacing w:before="128"/>
-        <w:ind w:firstLine="227"/>
-        <w:rPr>
-          <w:rFonts w:eastAsia="Verdana" w:hAnsi="Verdana" w:cs="Verdana"/>
-          <w:b/>
-          <w:bCs/>
-          <w:color w:val="1D1D1D"/>
-        </w:rPr>
-      </w:pPr>
-      <w:hyperlink r:id="rId4" w:history="1">
-        <w:r>
-          <w:rPr>
-            <w:rStyle w:val="Hyperlink"/>
-            <w:rFonts w:eastAsia="Verdana" w:hAnsi="Verdana" w:cs="Verdana"/>
-            <w:b/>
-            <w:bCs/>
-          </w:rPr>
-          <w:t>*Credential URL*</w:t>
-        </w:r>
-      </w:hyperlink>
     </w:p>
     <w:p>
       <w:pPr>
@@ -1123,6 +1447,7 @@
         <w:ind w:left="271" w:right="7520"/>
         <w:rPr>
           <w:b/>
+          <w:spacing w:val="-2"/>
           <w:sz w:val="26"/>
         </w:rPr>
       </w:pPr>
@@ -1141,6 +1466,87 @@
           <w:sz w:val="26"/>
         </w:rPr>
         <w:t>language2*</w:t>
+      </w:r>
+    </w:p>
+    <w:p>
+      <w:pPr>
+        <w:spacing w:before="1"/>
+        <w:ind w:right="7520"/>
+        <w:rPr>
+          <w:b/>
+          <w:sz w:val="26"/>
+        </w:rPr>
+      </w:pPr>
+      <w:r>
+        <w:rPr>
+          <w:noProof/>
+        </w:rPr>
+        <mc:AlternateContent>
+          <mc:Choice Requires="wps">
+            <w:drawing>
+              <wp:inline distT="0" distB="0" distL="0" distR="0" wp14:anchorId="0D163F5B" wp14:editId="627ED1F6">
+                <wp:extent cx="6040120" cy="1167"/>
+                <wp:effectExtent l="0" t="0" r="0" b="0"/>
+                <wp:docPr id="826720218" name="Graphic 2"/>
+                <wp:cNvGraphicFramePr>
+                  <a:graphicFrameLocks xmlns:a="http://schemas.openxmlformats.org/drawingml/2006/main"/>
+                </wp:cNvGraphicFramePr>
+                <a:graphic xmlns:a="http://schemas.openxmlformats.org/drawingml/2006/main">
+                  <a:graphicData uri="http://schemas.microsoft.com/office/word/2010/wordprocessingShape">
+                    <wps:wsp>
+                      <wps:cNvSpPr>
+                        <a:spLocks/>
+                      </wps:cNvSpPr>
+                      <wps:spPr>
+                        <a:xfrm>
+                          <a:off x="0" y="0"/>
+                          <a:ext cx="6040120" cy="1167"/>
+                        </a:xfrm>
+                        <a:custGeom>
+                          <a:avLst/>
+                          <a:gdLst/>
+                          <a:ahLst/>
+                          <a:cxnLst/>
+                          <a:rect l="l" t="t" r="r" b="b"/>
+                          <a:pathLst>
+                            <a:path w="6571615">
+                              <a:moveTo>
+                                <a:pt x="0" y="0"/>
+                              </a:moveTo>
+                              <a:lnTo>
+                                <a:pt x="6571488" y="0"/>
+                              </a:lnTo>
+                            </a:path>
+                          </a:pathLst>
+                        </a:custGeom>
+                        <a:ln w="19057">
+                          <a:solidFill>
+                            <a:srgbClr val="8053A1"/>
+                          </a:solidFill>
+                          <a:prstDash val="solid"/>
+                        </a:ln>
+                      </wps:spPr>
+                      <wps:bodyPr wrap="square" lIns="0" tIns="0" rIns="0" bIns="0" rtlCol="0">
+                        <a:prstTxWarp prst="textNoShape">
+                          <a:avLst/>
+                        </a:prstTxWarp>
+                        <a:noAutofit/>
+                      </wps:bodyPr>
+                    </wps:wsp>
+                  </a:graphicData>
+                </a:graphic>
+              </wp:inline>
+            </w:drawing>
+          </mc:Choice>
+          <mc:Fallback>
+            <w:pict>
+              <v:shape w14:anchorId="0E43E0A7" id="Graphic 2" o:spid="_x0000_s1026" style="width:475.6pt;height:.1pt;visibility:visible;mso-wrap-style:square;mso-left-percent:-10001;mso-top-percent:-10001;mso-position-horizontal:absolute;mso-position-horizontal-relative:char;mso-position-vertical:absolute;mso-position-vertical-relative:line;mso-left-percent:-10001;mso-top-percent:-10001;v-text-anchor:top" coordsize="6571615,1167" o:gfxdata="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" path="m,l6571488,e" filled="f" strokecolor="#8053a1" strokeweight=".52936mm">
+                <v:path arrowok="t"/>
+                <w10:anchorlock/>
+              </v:shape>
+            </w:pict>
+          </mc:Fallback>
+        </mc:AlternateContent>
       </w:r>
     </w:p>
     <w:p>
@@ -1178,6 +1584,7 @@
           <w:w w:val="115"/>
           <w:sz w:val="26"/>
         </w:rPr>
+        <w:lastRenderedPageBreak/>
         <w:t>PROJECTS</w:t>
       </w:r>
     </w:p>
@@ -1919,7 +2326,6 @@
   <w:style w:type="character" w:default="1" w:styleId="DefaultParagraphFont">
     <w:name w:val="Default Paragraph Font"/>
     <w:uiPriority w:val="1"/>
-    <w:semiHidden/>
     <w:unhideWhenUsed/>
   </w:style>
   <w:style w:type="table" w:default="1" w:styleId="TableNormal">

</xml_diff>